<commit_message>
feat: report work english
</commit_message>
<xml_diff>
--- a/Иностранный язык/Отчётная работа 2 сем.docx
+++ b/Иностранный язык/Отчётная работа 2 сем.docx
@@ -560,37 +560,15 @@
         </w:rPr>
         <w:t xml:space="preserve"> </w:t>
       </w:r>
-      <w:proofErr w:type="spellStart"/>
-      <w:r>
-        <w:rPr>
-          <w:color w:val="000000"/>
-          <w:sz w:val="28"/>
-          <w:szCs w:val="28"/>
-          <w:lang w:val="en-US"/>
-        </w:rPr>
-        <w:t>Prytkova</w:t>
-      </w:r>
-      <w:proofErr w:type="spellEnd"/>
-      <w:r>
-        <w:rPr>
-          <w:color w:val="000000"/>
-          <w:sz w:val="28"/>
-          <w:szCs w:val="28"/>
-          <w:lang w:val="en-US"/>
-        </w:rPr>
-        <w:t xml:space="preserve"> Oksana </w:t>
-      </w:r>
-      <w:proofErr w:type="spellStart"/>
-      <w:r>
-        <w:rPr>
-          <w:color w:val="000000"/>
-          <w:sz w:val="28"/>
-          <w:szCs w:val="28"/>
-          <w:lang w:val="en-US"/>
-        </w:rPr>
-        <w:t>Albertovna</w:t>
-      </w:r>
-      <w:proofErr w:type="spellEnd"/>
+      <w:r>
+        <w:rPr>
+          <w:color w:val="000000"/>
+          <w:sz w:val="28"/>
+          <w:szCs w:val="28"/>
+          <w:lang w:val="en-US"/>
+        </w:rPr>
+        <w:t>Prytkova Oksana Albertovna</w:t>
+      </w:r>
     </w:p>
     <w:p>
       <w:pPr>
@@ -679,32 +657,10 @@
     </w:p>
     <w:p>
       <w:pPr>
-        <w:ind w:firstLine="567"/>
-        <w:rPr>
-          <w:rFonts w:ascii="Times New Roman" w:eastAsia="Times New Roman" w:hAnsi="Times New Roman" w:cs="Times New Roman"/>
-          <w:color w:val="000000"/>
-          <w:sz w:val="28"/>
-          <w:szCs w:val="28"/>
-          <w:lang w:val="en-US"/>
-        </w:rPr>
-      </w:pPr>
-      <w:r>
-        <w:rPr>
-          <w:rFonts w:ascii="Times New Roman" w:eastAsia="Times New Roman" w:hAnsi="Times New Roman" w:cs="Times New Roman"/>
-          <w:color w:val="000000"/>
-          <w:sz w:val="28"/>
-          <w:szCs w:val="28"/>
-          <w:lang w:val="en-US"/>
-        </w:rPr>
+        <w:pStyle w:val="11"/>
+      </w:pPr>
+      <w:r>
         <w:lastRenderedPageBreak/>
-        <w:t>Hello everyone. Today, I will tell you about Alan Turing — one of the most brilliant scientists of the 20th century and a true pioneer in the world of computing. We will explore his early life, his greatest invention, his work during World War II, and the legacy he left behind.</w:t>
-      </w:r>
-    </w:p>
-    <w:p>
-      <w:pPr>
-        <w:pStyle w:val="11"/>
-      </w:pPr>
-      <w:r>
         <w:t>Alan Turing — The Father of Modern Computer Science</w:t>
       </w:r>
     </w:p>
@@ -833,18 +789,18 @@
         <w:pStyle w:val="11"/>
       </w:pPr>
       <w:r>
+        <w:t>The Turing Machine — The Theoretical Basis of Computers</w:t>
+      </w:r>
+    </w:p>
+    <w:p>
+      <w:pPr>
+        <w:pStyle w:val="11"/>
+      </w:pPr>
+      <w:r>
+        <w:rPr>
+          <w:noProof/>
+        </w:rPr>
         <w:lastRenderedPageBreak/>
-        <w:t>The Turing Machine — The Theoretical Basis of Computers</w:t>
-      </w:r>
-    </w:p>
-    <w:p>
-      <w:pPr>
-        <w:pStyle w:val="11"/>
-      </w:pPr>
-      <w:r>
-        <w:rPr>
-          <w:noProof/>
-        </w:rPr>
         <w:drawing>
           <wp:inline distT="0" distB="0" distL="0" distR="0" wp14:anchorId="6B798B68" wp14:editId="3E97DBA8">
             <wp:extent cx="5510212" cy="3997778"/>
@@ -996,29 +952,29 @@
         <w:pStyle w:val="11"/>
       </w:pPr>
       <w:r>
+        <w:t>Scientific Legacy</w:t>
+      </w:r>
+    </w:p>
+    <w:p>
+      <w:pPr>
+        <w:ind w:firstLine="567"/>
+        <w:rPr>
+          <w:rFonts w:ascii="Times New Roman" w:eastAsia="Times New Roman" w:hAnsi="Times New Roman" w:cs="Times New Roman"/>
+          <w:color w:val="000000"/>
+          <w:sz w:val="28"/>
+          <w:szCs w:val="28"/>
+          <w:lang w:val="en-US"/>
+        </w:rPr>
+      </w:pPr>
+      <w:r>
+        <w:rPr>
+          <w:rFonts w:ascii="Times New Roman" w:eastAsia="Times New Roman" w:hAnsi="Times New Roman" w:cs="Times New Roman"/>
+          <w:color w:val="000000"/>
+          <w:sz w:val="28"/>
+          <w:szCs w:val="28"/>
+          <w:lang w:val="en-US"/>
+        </w:rPr>
         <w:lastRenderedPageBreak/>
-        <w:t>Scientific Legacy</w:t>
-      </w:r>
-    </w:p>
-    <w:p>
-      <w:pPr>
-        <w:ind w:firstLine="567"/>
-        <w:rPr>
-          <w:rFonts w:ascii="Times New Roman" w:eastAsia="Times New Roman" w:hAnsi="Times New Roman" w:cs="Times New Roman"/>
-          <w:color w:val="000000"/>
-          <w:sz w:val="28"/>
-          <w:szCs w:val="28"/>
-          <w:lang w:val="en-US"/>
-        </w:rPr>
-      </w:pPr>
-      <w:r>
-        <w:rPr>
-          <w:rFonts w:ascii="Times New Roman" w:eastAsia="Times New Roman" w:hAnsi="Times New Roman" w:cs="Times New Roman"/>
-          <w:color w:val="000000"/>
-          <w:sz w:val="28"/>
-          <w:szCs w:val="28"/>
-          <w:lang w:val="en-US"/>
-        </w:rPr>
         <w:t>After the war, Turing continued to explore ideas in computing and artificial intelligence. He proposed the famous Turing Test — a method for determining whether a machine can exhibit intelligent behavior similar to that of a human. This test is still widely discussed today.</w:t>
       </w:r>
     </w:p>
@@ -1144,7 +1100,6 @@
         <w:docPartUnique/>
       </w:docPartObj>
     </w:sdtPr>
-    <w:sdtEndPr/>
     <w:sdtContent>
       <w:p>
         <w:pPr>

</xml_diff>